<commit_message>
docs: expand programming tools overview
</commit_message>
<xml_diff>
--- a/docs/пояснительная-записка-auhub.docx
+++ b/docs/пояснительная-записка-auhub.docx
@@ -1468,506 +1468,247 @@
         <w:jc w:val="both"/>
       </w:pPr>
       <w:r>
-        <w:t xml:space="preserve">При выборе средств программирования учитывались не только популярность и наличие документации, но и соответствие требованиям проекта: поддержка микросервисной архитектуры, строгая типизация, удобство асинхронной работы, готовые механизмы real-time взаимодействия, воспроизводимый запуск в Docker и возможность дальнейшего масштабирования. Отдельно оценивалась сложность внедрения: для дипломного проекта стек должен быть достаточно современным, но не избыточным.</w:t>
-      </w:r>
-    </w:p>
-    <w:p>
-      <w:pPr>
-        <w:ind w:firstLine="709"/>
-        <w:jc w:val="both"/>
-      </w:pPr>
-      <w:r>
-        <w:t xml:space="preserve">В результате был выбран стек, в котором серверная часть реализуется на C# и .NET, клиентская часть — на TypeScript, React и Next.js, хранение данных — в PostgreSQL, объектное хранилище — через MinIO, а межсервисная инфраструктура включает YARP Gateway, RabbitMQ/MassTransit и Docker Compose. Такой набор технологий позволяет показать не только пользовательский интерфейс, но и полноценную серверную архитектуру с разделением ответственности между сервисами.</w:t>
-      </w:r>
-    </w:p>
-    <w:p>
-      <w:r>
-        <w:t>Серверный язык и платформа</w:t>
-      </w:r>
-    </w:p>
-    <w:p>
-      <w:pPr>
-        <w:ind w:firstLine="709"/>
-        <w:jc w:val="both"/>
-      </w:pPr>
-      <w:r>
-        <w:t xml:space="preserve">Для бэкенда рассматривались C#/.NET, Java/Spring Boot, Go и Node.js с TypeScript. Java имеет зрелую экосистему и хорошую поддержку микросервисов, но требует большего объёма шаблонного кода и обычно даёт более тяжёлую инфраструктуру для небольшого проекта. Go компилируется в небольшие бинарники и хорошо подходит для высоконагруженных сервисов, но его экосистема для SignalR-подобного взаимодействия и быстрой разработки бизнес-API беднее. Node.js с TypeScript удобен тем, что позволяет использовать один язык на клиенте и сервере, однако для сложной серверной доменной логики, фоновых служб и строгой типизации на уровне платформы .NET выглядит надёжнее. C# с .NET 10 LTS даёт строгую типизацию, async/await, встроенный DI-контейнер, Hosted Services, Entity Framework Core, SignalR и зрелую инфраструктуру тестирования. Поэтому основным языком серверной части выбран C#.</w:t>
-      </w:r>
-    </w:p>
-    <w:p>
-      <w:r>
-        <w:t>Веб-фреймворк</w:t>
-      </w:r>
-    </w:p>
-    <w:p>
-      <w:pPr>
-        <w:ind w:firstLine="709"/>
-        <w:jc w:val="both"/>
-      </w:pPr>
-      <w:r>
-        <w:t xml:space="preserve">Для построения API сравнивались ASP.NET Core MVC, </w:t>
-      </w:r>
-      <w:proofErr w:type="spellStart"/>
-      <w:r>
-        <w:t>Minimal</w:t>
-      </w:r>
-      <w:proofErr w:type="spellEnd"/>
-      <w:r>
-        <w:t xml:space="preserve"> API и </w:t>
-      </w:r>
-      <w:proofErr w:type="spellStart"/>
-      <w:r>
-        <w:t>FastEndpoints</w:t>
-      </w:r>
-      <w:proofErr w:type="spellEnd"/>
-      <w:r>
-        <w:t xml:space="preserve">. MVC — зрелый фреймворк с богатой экосистемой, но контроллеры с большим количеством методов становятся трудными для навигации и тестирования. </w:t>
-      </w:r>
-      <w:proofErr w:type="spellStart"/>
-      <w:r>
-        <w:t>Minimal</w:t>
-      </w:r>
-      <w:proofErr w:type="spellEnd"/>
-      <w:r>
-        <w:t xml:space="preserve"> API в .NET избавляет от контроллеров и регистрирует маршруты напрямую, что удобно для небольших сервисов, но не предлагает готовой структуры для более сложных проектов. </w:t>
-      </w:r>
-      <w:proofErr w:type="spellStart"/>
-      <w:r>
-        <w:t>FastEndpoints</w:t>
-      </w:r>
-      <w:proofErr w:type="spellEnd"/>
-      <w:r>
-        <w:t xml:space="preserve"> реализует паттерн REPR (</w:t>
-      </w:r>
-      <w:proofErr w:type="spellStart"/>
-      <w:r>
-        <w:t>Request</w:t>
-      </w:r>
-      <w:proofErr w:type="spellEnd"/>
-      <w:r>
-        <w:t>-</w:t>
-      </w:r>
-      <w:proofErr w:type="spellStart"/>
-      <w:r>
-        <w:t>Endpoint</w:t>
-      </w:r>
-      <w:proofErr w:type="spellEnd"/>
-      <w:r>
-        <w:t>-Response): каждый HTTP-</w:t>
-      </w:r>
-      <w:proofErr w:type="spellStart"/>
-      <w:r>
-        <w:t>эндпоинт</w:t>
-      </w:r>
-      <w:proofErr w:type="spellEnd"/>
-      <w:r>
-        <w:t xml:space="preserve"> — это отдельный класс с методами </w:t>
-      </w:r>
-      <w:proofErr w:type="spellStart"/>
-      <w:proofErr w:type="gramStart"/>
-      <w:r>
-        <w:t>Configure</w:t>
-      </w:r>
-      <w:proofErr w:type="spellEnd"/>
-      <w:r>
-        <w:t>(</w:t>
-      </w:r>
-      <w:proofErr w:type="gramEnd"/>
-      <w:r>
-        <w:t xml:space="preserve">) и </w:t>
-      </w:r>
-      <w:proofErr w:type="spellStart"/>
-      <w:proofErr w:type="gramStart"/>
-      <w:r>
-        <w:t>HandleAsync</w:t>
-      </w:r>
-      <w:proofErr w:type="spellEnd"/>
-      <w:r>
-        <w:t>(</w:t>
-      </w:r>
-      <w:proofErr w:type="gramEnd"/>
-      <w:r>
-        <w:t xml:space="preserve">). Это хорошо сочетается с </w:t>
-      </w:r>
-      <w:proofErr w:type="spellStart"/>
-      <w:r>
-        <w:t>Vertical</w:t>
-      </w:r>
-      <w:proofErr w:type="spellEnd"/>
-      <w:r>
-        <w:t xml:space="preserve"> </w:t>
-      </w:r>
-      <w:proofErr w:type="spellStart"/>
-      <w:r>
-        <w:t>Slice</w:t>
-      </w:r>
-      <w:proofErr w:type="spellEnd"/>
-      <w:r>
-        <w:t xml:space="preserve"> Architecture, которую я использую в проекте: весь код одной фичи (команда, обработчик, </w:t>
-      </w:r>
-      <w:proofErr w:type="spellStart"/>
-      <w:r>
-        <w:t>эндпоинт</w:t>
-      </w:r>
-      <w:proofErr w:type="spellEnd"/>
-      <w:r>
-        <w:t xml:space="preserve">, валидатор) живёт в одном каталоге. Я выбрал </w:t>
-      </w:r>
-      <w:proofErr w:type="spellStart"/>
-      <w:r>
-        <w:t>FastEndpoints</w:t>
-      </w:r>
-      <w:proofErr w:type="spellEnd"/>
-      <w:r>
-        <w:t xml:space="preserve"> 8.0+.</w:t>
-      </w:r>
-    </w:p>
-    <w:p>
-      <w:pPr>
-        <w:ind w:firstLine="709"/>
-        <w:jc w:val="both"/>
-      </w:pPr>
-      <w:r>
-        <w:t xml:space="preserve">Дополнительно рассматривался вопрос организации бизнес-логики внутри сервисов. Классический слой контроллеров и сервисов проще объяснить, но при росте числа сценариев он быстро превращается в набор крупных классов с разнородной ответственностью. Поэтому в AuHub используется сочетание Clean Architecture и Vertical Slice Architecture: доменная логика отделена от инфраструктуры, а каждый пользовательский сценарий оформлен как отдельный вертикальный срез. Это упрощает тестирование команд вроде создания лота, размещения ставки или завершения аукциона.</w:t>
-      </w:r>
-    </w:p>
-    <w:p>
-      <w:r>
-        <w:t>База данных</w:t>
-      </w:r>
-    </w:p>
-    <w:p>
-      <w:pPr>
-        <w:ind w:firstLine="709"/>
-        <w:jc w:val="both"/>
-      </w:pPr>
-      <w:r>
-        <w:t xml:space="preserve">Для хранения данных рассматривались PostgreSQL, MySQL и MongoDB. MongoDB — документная база, которая не требует фиксированной схемы, но реляционные связи в ней неудобны, а транзакционная логика вроде обновления текущей цены при ставке сложнее. MySQL хорошо известен, но PostgreSQL превосходит его в поддержке расширенных возможностей SQL, UUID как первичных ключей, транзакций и сложных запросов. Взаимодействие с базой данных реализовано через EF Core 10 с подходом Code First: структура таблиц описывается в C#-классах, миграции генерируются автоматически. Я выбрал PostgreSQL 16. Каждый основной сервис имеет свою отдельную базу данных, что соответствует микросервисному принципу независимого владения данными.</w:t>
-      </w:r>
-    </w:p>
-    <w:p>
-      <w:r>
-        <w:t>Объектное хранилище изображений</w:t>
-      </w:r>
-    </w:p>
-    <w:p>
-      <w:pPr>
-        <w:ind w:firstLine="709"/>
-        <w:jc w:val="both"/>
-      </w:pPr>
-      <w:proofErr w:type="spellStart"/>
-      <w:r>
-        <w:t>MinIO</w:t>
-      </w:r>
-      <w:proofErr w:type="spellEnd"/>
-      <w:r>
-        <w:t xml:space="preserve"> — S3-совместимое объектное хранилище с открытым исходным кодом. Оно запускается в </w:t>
-      </w:r>
-      <w:proofErr w:type="spellStart"/>
-      <w:r>
-        <w:t>Docker</w:t>
-      </w:r>
-      <w:proofErr w:type="spellEnd"/>
-      <w:r>
-        <w:t xml:space="preserve">-контейнере и предоставляет тот же API, что и AWS S3. Изображения сохраняются в </w:t>
-      </w:r>
-      <w:proofErr w:type="spellStart"/>
-      <w:r>
-        <w:t>bucket</w:t>
-      </w:r>
-      <w:proofErr w:type="spellEnd"/>
-      <w:r>
-        <w:t xml:space="preserve"> </w:t>
-      </w:r>
-      <w:proofErr w:type="spellStart"/>
-      <w:r>
-        <w:t>auhub-lots</w:t>
-      </w:r>
-      <w:proofErr w:type="spellEnd"/>
-      <w:r>
-        <w:t xml:space="preserve"> по пути </w:t>
-      </w:r>
-      <w:proofErr w:type="spellStart"/>
-      <w:r>
-        <w:t>lots</w:t>
-      </w:r>
-      <w:proofErr w:type="spellEnd"/>
-      <w:r>
-        <w:t>/{</w:t>
-      </w:r>
-      <w:proofErr w:type="spellStart"/>
-      <w:r>
-        <w:t>lotId</w:t>
-      </w:r>
-      <w:proofErr w:type="spellEnd"/>
-      <w:r>
-        <w:t>}/{</w:t>
-      </w:r>
-      <w:proofErr w:type="spellStart"/>
-      <w:r>
-        <w:t>hash</w:t>
-      </w:r>
-      <w:proofErr w:type="spellEnd"/>
-      <w:proofErr w:type="gramStart"/>
-      <w:r>
-        <w:t>}.{</w:t>
-      </w:r>
-      <w:proofErr w:type="spellStart"/>
-      <w:proofErr w:type="gramEnd"/>
-      <w:r>
-        <w:t>ext</w:t>
-      </w:r>
-      <w:proofErr w:type="spellEnd"/>
-      <w:r>
-        <w:t>}, метаданные (</w:t>
-      </w:r>
-      <w:proofErr w:type="spellStart"/>
-      <w:r>
-        <w:t>objectName</w:t>
-      </w:r>
-      <w:proofErr w:type="spellEnd"/>
-      <w:r>
-        <w:t xml:space="preserve">, </w:t>
-      </w:r>
-      <w:proofErr w:type="spellStart"/>
-      <w:r>
-        <w:t>fileName</w:t>
-      </w:r>
-      <w:proofErr w:type="spellEnd"/>
-      <w:r>
-        <w:t xml:space="preserve">, </w:t>
-      </w:r>
-      <w:proofErr w:type="spellStart"/>
-      <w:r>
-        <w:t>contentType</w:t>
-      </w:r>
-      <w:proofErr w:type="spellEnd"/>
-      <w:r>
-        <w:t xml:space="preserve">) — в таблице </w:t>
-      </w:r>
-      <w:proofErr w:type="spellStart"/>
-      <w:r>
-        <w:t>LotImages</w:t>
-      </w:r>
-      <w:proofErr w:type="spellEnd"/>
-      <w:r>
-        <w:t xml:space="preserve"> базы данных. Доступ к изображениям клиент получает через </w:t>
-      </w:r>
-      <w:proofErr w:type="spellStart"/>
-      <w:r>
-        <w:t>эндпоинт</w:t>
-      </w:r>
-      <w:proofErr w:type="spellEnd"/>
-      <w:r>
-        <w:t xml:space="preserve"> GET /</w:t>
-      </w:r>
-      <w:proofErr w:type="spellStart"/>
-      <w:r>
-        <w:t>api</w:t>
-      </w:r>
-      <w:proofErr w:type="spellEnd"/>
-      <w:r>
-        <w:t>/</w:t>
-      </w:r>
-      <w:proofErr w:type="spellStart"/>
-      <w:r>
-        <w:t>lots</w:t>
-      </w:r>
-      <w:proofErr w:type="spellEnd"/>
-      <w:r>
-        <w:t>/{</w:t>
-      </w:r>
-      <w:proofErr w:type="spellStart"/>
-      <w:r>
-        <w:t>id</w:t>
-      </w:r>
-      <w:proofErr w:type="spellEnd"/>
-      <w:r>
-        <w:t>}/</w:t>
-      </w:r>
-      <w:proofErr w:type="spellStart"/>
-      <w:r>
-        <w:t>images</w:t>
-      </w:r>
-      <w:proofErr w:type="spellEnd"/>
-      <w:r>
-        <w:t>/{</w:t>
-      </w:r>
-      <w:proofErr w:type="spellStart"/>
-      <w:r>
-        <w:t>fileName</w:t>
-      </w:r>
-      <w:proofErr w:type="spellEnd"/>
-      <w:r>
-        <w:t xml:space="preserve">}: сервис стримит файл из </w:t>
-      </w:r>
-      <w:proofErr w:type="spellStart"/>
-      <w:r>
-        <w:t>MinIO</w:t>
-      </w:r>
-      <w:proofErr w:type="spellEnd"/>
-      <w:r>
-        <w:t xml:space="preserve"> с заголовком </w:t>
-      </w:r>
-      <w:proofErr w:type="spellStart"/>
-      <w:r>
-        <w:t>Cache</w:t>
-      </w:r>
-      <w:proofErr w:type="spellEnd"/>
-      <w:r>
-        <w:t xml:space="preserve">-Control: </w:t>
-      </w:r>
-      <w:proofErr w:type="spellStart"/>
-      <w:r>
-        <w:t>public</w:t>
-      </w:r>
-      <w:proofErr w:type="spellEnd"/>
-      <w:r>
-        <w:t xml:space="preserve">, </w:t>
-      </w:r>
-      <w:proofErr w:type="spellStart"/>
-      <w:r>
-        <w:t>max-age</w:t>
-      </w:r>
-      <w:proofErr w:type="spellEnd"/>
-      <w:r>
-        <w:t xml:space="preserve">=86400. Прямой доступ к </w:t>
-      </w:r>
-      <w:proofErr w:type="spellStart"/>
-      <w:r>
-        <w:t>MinIO</w:t>
-      </w:r>
-      <w:proofErr w:type="spellEnd"/>
-      <w:r>
-        <w:t xml:space="preserve"> снаружи </w:t>
-      </w:r>
-      <w:proofErr w:type="spellStart"/>
-      <w:r>
-        <w:t>Docker</w:t>
-      </w:r>
-      <w:proofErr w:type="spellEnd"/>
-      <w:r>
-        <w:t xml:space="preserve">-сети закрыт. Для работы с </w:t>
-      </w:r>
-      <w:proofErr w:type="spellStart"/>
-      <w:r>
-        <w:t>MinIO</w:t>
-      </w:r>
-      <w:proofErr w:type="spellEnd"/>
-      <w:r>
-        <w:t xml:space="preserve"> из .NET используется официальный SDK </w:t>
-      </w:r>
-      <w:proofErr w:type="spellStart"/>
-      <w:r>
-        <w:t>Minio.Client</w:t>
-      </w:r>
-      <w:proofErr w:type="spellEnd"/>
-      <w:r>
-        <w:t xml:space="preserve"> 6.0.4.</w:t>
-      </w:r>
-    </w:p>
-    <w:p>
-      <w:pPr>
-        <w:ind w:firstLine="709"/>
-        <w:jc w:val="both"/>
-      </w:pPr>
-      <w:r>
-        <w:t xml:space="preserve">Для асинхронного обмена событиями между сервисами используется RabbitMQ и библиотека MassTransit. Альтернативой были прямые HTTP-вызовы между всеми сервисами, но такой подход сильнее связывает компоненты и усложняет обработку временной недоступности получателя. Очередь сообщений позволяет публиковать события, например о новой ставке или завершении аукциона, а заинтересованные сервисы обрабатывают их независимо. MassTransit выбран потому, что он хорошо интегрируется с .NET, поддерживает consumers, retry-политики и упрощает работу с RabbitMQ без ручной настройки низкоуровневого протокола AMQP.</w:t>
-      </w:r>
-    </w:p>
-    <w:p>
-      <w:pPr>
-        <w:ind w:firstLine="709"/>
-        <w:jc w:val="both"/>
-      </w:pPr>
-      <w:r>
-        <w:t xml:space="preserve">Для платёжной логики выделен отдельный Payment Service. Это позволяет отделить операции кошелька, резервирования средств и истории транзакций от домена аукционов. В дипломной версии критичные платёжные действия выполняются через прямую оркестрацию из сервиса аукционов, потому что такой поток проще контролировать и тестировать. Событийная модель при этом остаётся полезной для уведомлений и последующей интеграции с внешними платёжными провайдерами.</w:t>
-      </w:r>
-    </w:p>
-    <w:p>
-      <w:r>
-        <w:t>Real-</w:t>
-      </w:r>
-      <w:proofErr w:type="spellStart"/>
-      <w:r>
-        <w:t>time</w:t>
-      </w:r>
-      <w:proofErr w:type="spellEnd"/>
-      <w:r>
-        <w:t xml:space="preserve"> обновления</w:t>
-      </w:r>
-    </w:p>
-    <w:p>
-      <w:pPr>
-        <w:ind w:firstLine="709"/>
-        <w:jc w:val="both"/>
-      </w:pPr>
-      <w:r>
-        <w:t xml:space="preserve">SignalR — это фреймворк Microsoft для организации двусторонней связи между сервером и клиентом через WebSocket. Он входит в состав ASP.NET Core и не требует дополнительных зависимостей на бэкенде. Hub /hubs/auction рассылает два типа событий: NewBidPlaced (новая ставка с обновлённой ценой) и LotCompleted (завершение аукциона с ID победителя). На клиенте используется пакет @microsoft/signalr 8+, подключение настроено с withAutomaticReconnect. Для работы через YARP Gateway настроена cookie-based session affinity — это гарантирует, что все запросы одного клиента, включая WebSocket upgrade, попадают на один экземпляр Auctions Service.</w:t>
-      </w:r>
-    </w:p>
-    <w:p>
-      <w:r>
-        <w:t>API-шлюз YARP</w:t>
-      </w:r>
-    </w:p>
-    <w:p>
-      <w:pPr>
-        <w:ind w:firstLine="709"/>
-        <w:jc w:val="both"/>
-      </w:pPr>
-      <w:r>
-        <w:t xml:space="preserve">YARP (Yet Another Reverse Proxy) — библиотека обратного прокси от Microsoft, встраиваемая в ASP.NET Core-приложение. Конфигурация маршрутов задаётся в файле конфигурации или программно: /api/auth/* направляется к Identity Service, /api/lots/* и /hubs/auction — к Auctions Service, а остальные маршруты распределяются между сервисами платежей и уведомлений. YARP корректно проксирует WebSocket upgrade-запросы для SignalR. Session affinity реализована через стандартный механизм YARP — куки с хешем экземпляра. Gateway работает на порту 5000 и является единственной точкой входа снаружи Docker-сети.</w:t>
-      </w:r>
-    </w:p>
-    <w:p>
-      <w:r>
-        <w:t>Фронтенд</w:t>
-      </w:r>
-    </w:p>
-    <w:p>
-      <w:pPr>
-        <w:ind w:firstLine="709"/>
-        <w:jc w:val="both"/>
-      </w:pPr>
-      <w:r>
-        <w:t xml:space="preserve">Фронтенд построен на Next.js 16.2 с App Router. Главная страница и страница лота используют React Server Components и рендерятся на сервере. Данные о лотах загружаются на сервере через fetch, метатеги прописываются через generateMetadata. Это обеспечивает индексирование страниц поисковыми системами. Интерактивные компоненты — форма ставки BidForm, карточка лота LotCard с таймером, загрузчик изображений ImageUpload — помечены директивой 'use client' и работают в браузере. Стилизация сделана на Tailwind CSS 4, HTTP-запросы выполняются через Axios с интерсепторами, которые автоматически добавляют Bearer-токен и обновляют его при 401. Состояние авторизации хранится в AuthContext.</w:t>
-      </w:r>
-    </w:p>
-    <w:p>
-      <w:r>
-        <w:t>Контейнеризация</w:t>
-      </w:r>
-    </w:p>
-    <w:p>
-      <w:pPr>
-        <w:ind w:firstLine="709"/>
-        <w:jc w:val="both"/>
-        <w:rPr>
-          <w:lang w:val="en-US"/>
-        </w:rPr>
-      </w:pPr>
-      <w:r>
-        <w:t xml:space="preserve">Все компоненты системы упакованы в Docker-контейнеры и описаны в docker-compose.yml. Файл запускает базы данных сервисов, API-приложения, Gateway, RabbitMQ, MinIO и frontend. Для PostgreSQL-контейнеров настроены healthcheck-проверки через pg_isready, а API-контейнеры запускаются только после готовности зависимостей через condition: service_healthy. Каждый сервис собирается из собственного Dockerfile с многоступенчатой сборкой (multistage build) для минимизации размера финального образа.</w:t>
-      </w:r>
-    </w:p>
-    <w:p>
-      <w:pPr>
-        <w:ind w:firstLine="709"/>
-        <w:jc w:val="both"/>
-      </w:pPr>
-      <w:r>
-        <w:t xml:space="preserve">Для проверки качества кода используются модульные тесты xUnit на серверной части и инструменты сборки фронтенда Next.js. В перспективе для полного покрытия пользовательских сценариев целесообразно использовать интеграционные тесты с Testcontainers и E2E-тесты Playwright. Это важно для платформы онлайн-аукционов, потому что ключевые сценарии — регистрация, создание лота, модерация, пополнение кошелька и ставка — затрагивают сразу несколько сервисов.</w:t>
-      </w:r>
-    </w:p>
-    <w:p>
-      <w:pPr>
-        <w:ind w:firstLine="709"/>
-        <w:jc w:val="both"/>
-        <w:rPr>
-          <w:lang w:val="en-US"/>
-        </w:rPr>
-      </w:pPr>
+        <w:t xml:space="preserve">В данном разделе рассматриваются средства программирования, использованные при разработке AuHub. Под средствами программирования понимаются не только языки, но и платформы, фреймворки, библиотеки, системы хранения данных, инструменты контейнеризации и тестирования. Для каждого ключевого средства сначала описываются его назначение и возможные альтернативы, затем приводится обоснование выбора именно для разрабатываемой аукционной платформы.</w:t>
+      </w:r>
+    </w:p>
+    <w:p>
+      <w:pPr>
+        <w:ind w:firstLine="709"/>
+        <w:jc w:val="both"/>
+      </w:pPr>
+      <w:r>
+        <w:t xml:space="preserve">При выборе учитывались следующие критерии: поддержка микросервисной архитектуры, строгая типизация, удобство асинхронной обработки, наличие готовых инструментов для real-time взаимодействия, воспроизводимость запуска в Docker, качество документации и возможность дальнейшего развития проекта. Такой подход позволяет выбирать технологии не по популярности, а по соответствию конкретным требованиям системы онлайн-аукционов.</w:t>
+      </w:r>
+    </w:p>
+    <w:p>
+      <w:r>
+        <w:t xml:space="preserve">Серверный язык и платформа</w:t>
+      </w:r>
+    </w:p>
+    <w:p>
+      <w:pPr>
+        <w:ind w:firstLine="709"/>
+        <w:jc w:val="both"/>
+      </w:pPr>
+      <w:r>
+        <w:t xml:space="preserve">В качестве серверного языка рассматривались C# с платформой .NET, Java со Spring Boot, Go и Node.js с TypeScript. Java и Spring Boot обладают зрелой корпоративной экосистемой и хорошо подходят для микросервисов, но требуют большего количества шаблонного кода и обычно создают более тяжёлую инфраструктуру. Go даёт компактные исполняемые файлы и высокую производительность, однако его экосистема для быстрой разработки бизнес-API, фоновых служб и SignalR-подобного real-time взаимодействия беднее. Node.js с TypeScript удобен за счёт единого языка на клиенте и сервере, но для строгой доменной модели, транзакционной логики и фоновой обработки платформа .NET предоставляет более цельный набор инструментов.</w:t>
+      </w:r>
+    </w:p>
+    <w:p>
+      <w:pPr>
+        <w:ind w:firstLine="709"/>
+        <w:jc w:val="both"/>
+      </w:pPr>
+      <w:r>
+        <w:t xml:space="preserve">Для AuHub выбран C# и .NET 10 LTS. Этот выбор обоснован тем, что серверная часть проекта содержит не только простые HTTP-эндпоинты, но и доменные правила ставок, обработку статусов лотов, фоновые сервисы завершения аукционов, работу с PostgreSQL, SignalR и межсервисное взаимодействие. C# обеспечивает строгую типизацию, Nullable Reference Types, record-типы, async/await и выразительные средства описания бизнес-логики. .NET дополняет язык встроенным DI-контейнером, Hosted Services, ASP.NET Core, EF Core, SignalR, YARP и зрелой инфраструктурой тестирования. Поэтому C# является основным языком серверной реализации.</w:t>
+      </w:r>
+    </w:p>
+    <w:p>
+      <w:r>
+        <w:t xml:space="preserve">Веб-фреймворк и организация API</w:t>
+      </w:r>
+    </w:p>
+    <w:p>
+      <w:pPr>
+        <w:ind w:firstLine="709"/>
+        <w:jc w:val="both"/>
+      </w:pPr>
+      <w:r>
+        <w:t xml:space="preserve">Для построения API сравнивались ASP.NET Core MVC, Minimal API и FastEndpoints. MVC является классическим вариантом для ASP.NET Core и хорошо подходит для традиционных приложений с контроллерами. Minimal API уменьшает количество инфраструктурного кода и позволяет быстро описывать маршруты, но в крупном проекте может потребовать дополнительной ручной организации структуры. FastEndpoints строит API вокруг отдельных endpoint-классов и паттерна Request-Endpoint-Response, где каждый сценарий имеет собственный request, response, validator и обработчик.</w:t>
+      </w:r>
+    </w:p>
+    <w:p>
+      <w:pPr>
+        <w:ind w:firstLine="709"/>
+        <w:jc w:val="both"/>
+      </w:pPr>
+      <w:r>
+        <w:t xml:space="preserve">В AuHub выбран FastEndpoints, потому что он хорошо сочетается с Vertical Slice Architecture. Сценарии вроде создания лота, размещения ставки или пополнения кошелька оформляются как отдельные вертикальные срезы, а не размазываются по крупным контроллерам. Это упрощает навигацию по проекту, изолирует бизнес-логику и делает тестирование более прямым. Для дипломного проекта это также удобно с точки зрения демонстрации архитектуры: каждый пользовательский сценарий можно показать как самостоятельный модуль.</w:t>
+      </w:r>
+    </w:p>
+    <w:p>
+      <w:r>
+        <w:t xml:space="preserve">Архитектурные паттерны серверной части</w:t>
+      </w:r>
+    </w:p>
+    <w:p>
+      <w:pPr>
+        <w:ind w:firstLine="709"/>
+        <w:jc w:val="both"/>
+      </w:pPr>
+      <w:r>
+        <w:t xml:space="preserve">Помимо выбора фреймворка, важен способ организации кода внутри сервисов. Рассматривались классическая слоистая архитектура, Clean Architecture и Vertical Slice Architecture. Простая слоистая схема понятна на старте, но при росте числа сценариев приводит к крупным сервисным классам и слабой локализации изменений. Clean Architecture задаёт направление зависимостей от внешних слоёв к домену, а Vertical Slice Architecture группирует код по пользовательским сценариям.</w:t>
+      </w:r>
+    </w:p>
+    <w:p>
+      <w:pPr>
+        <w:ind w:firstLine="709"/>
+        <w:jc w:val="both"/>
+      </w:pPr>
+      <w:r>
+        <w:t xml:space="preserve">В проекте используется сочетание Clean Architecture, CQRS и Vertical Slice Architecture. Доменная логика лотов, ставок и платежных операций не зависит от HTTP, базы данных и внешних сервисов. Команды и запросы разделены, а каждый сценарий имеет свой обработчик. Такой подход выбран потому, что AuHub содержит несколько доменных областей и должен оставаться сопровождаемым при добавлении новых функций: модерации, платежей, уведомлений и споров.</w:t>
+      </w:r>
+    </w:p>
+    <w:p>
+      <w:r>
+        <w:t xml:space="preserve">База данных и ORM</w:t>
+      </w:r>
+    </w:p>
+    <w:p>
+      <w:pPr>
+        <w:ind w:firstLine="709"/>
+        <w:jc w:val="both"/>
+      </w:pPr>
+      <w:r>
+        <w:t xml:space="preserve">Для хранения данных рассматривались PostgreSQL, MySQL и MongoDB. MongoDB удобна для гибких документных структур, но хуже подходит для транзакционной логики с выраженными связями между сущностями. MySQL является распространённой реляционной СУБД, однако PostgreSQL лучше подходит для сложных запросов, работы с UUID, транзакций, расширяемости и строгой схемы данных. Для доступа к данным в .NET рассматривались ручной SQL, Dapper и Entity Framework Core.</w:t>
+      </w:r>
+    </w:p>
+    <w:p>
+      <w:pPr>
+        <w:ind w:firstLine="709"/>
+        <w:jc w:val="both"/>
+      </w:pPr>
+      <w:r>
+        <w:t xml:space="preserve">Для AuHub выбран PostgreSQL 16 и Entity Framework Core. В системе есть сущности с устойчивыми связями: пользователи, лоты, ставки, изображения, платежные операции и уведомления. Реляционная модель хорошо отражает эти зависимости, а транзакции важны для корректной обработки ставок и кошелька. EF Core выбран потому, что позволяет описывать модель в C#-коде, использовать миграции, LINQ-запросы и optimistic concurrency. При этом каждый микросервис владеет своей базой данных, что соответствует принципу независимого владения данными.</w:t>
+      </w:r>
+    </w:p>
+    <w:p>
+      <w:r>
+        <w:t xml:space="preserve">Объектное хранилище изображений</w:t>
+      </w:r>
+    </w:p>
+    <w:p>
+      <w:pPr>
+        <w:ind w:firstLine="709"/>
+        <w:jc w:val="both"/>
+      </w:pPr>
+      <w:r>
+        <w:t xml:space="preserve">Для хранения изображений лотов рассматривались файловая система сервера, внешнее облачное S3-хранилище и локальное S3-совместимое хранилище MinIO. Хранение файлов на диске удобно в простом приложении, но плохо масштабируется: при запуске нескольких экземпляров сервиса файлы оказываются привязаны к конкретному узлу. AWS S3 или Yandex Cloud Storage решают эту проблему, но требуют внешнего облачного аккаунта и усложняют локальную разработку.</w:t>
+      </w:r>
+    </w:p>
+    <w:p>
+      <w:pPr>
+        <w:ind w:firstLine="709"/>
+        <w:jc w:val="both"/>
+      </w:pPr>
+      <w:r>
+        <w:t xml:space="preserve">В проекте выбран MinIO. Он запускается в Docker Compose, предоставляет S3-совместимый API и позволяет локально отработать ту же модель хранения, которая применима в production при переходе на облачное хранилище. В AuHub изображения сохраняются как объекты, а в базе данных хранится только metadata: имя объекта, имя файла и content type. Такой подход отделяет бинарные данные от реляционной базы и упрощает перенос хранения в облако.</w:t>
+      </w:r>
+    </w:p>
+    <w:p>
+      <w:r>
+        <w:t xml:space="preserve">Межсервисное взаимодействие и сообщения</w:t>
+      </w:r>
+    </w:p>
+    <w:p>
+      <w:pPr>
+        <w:ind w:firstLine="709"/>
+        <w:jc w:val="both"/>
+      </w:pPr>
+      <w:r>
+        <w:t xml:space="preserve">Для взаимодействия сервисов рассматривались прямые HTTP-вызовы, очередь сообщений RabbitMQ и более сложные брокеры вроде Kafka. HTTP прост и хорошо подходит для синхронных операций, когда вызывающему сервису нужен немедленный ответ. Kafka рассчитана на большие потоки событий и аналитические сценарии, но для дипломной системы она была бы избыточной. RabbitMQ ориентирован на очереди задач и событий между сервисами, а MassTransit упрощает его использование в .NET через consumers, publish/subscribe и retry-механизмы.</w:t>
+      </w:r>
+    </w:p>
+    <w:p>
+      <w:pPr>
+        <w:ind w:firstLine="709"/>
+        <w:jc w:val="both"/>
+      </w:pPr>
+      <w:r>
+        <w:t xml:space="preserve">В AuHub используется сочетание HTTP и RabbitMQ/MassTransit. Критичные платежные операции выполняются через управляемую HTTP-оркестрацию, потому что для них важен немедленный результат и строгий контроль последовательности действий. События аукционов и уведомлений могут передаваться асинхронно через RabbitMQ, чтобы сервисы не были жёстко связаны друг с другом. Такой выбор даёт баланс между простотой реализации и демонстрацией микросервисного подхода.</w:t>
+      </w:r>
+    </w:p>
+    <w:p>
+      <w:r>
+        <w:t xml:space="preserve">Real-time обновления</w:t>
+      </w:r>
+    </w:p>
+    <w:p>
+      <w:pPr>
+        <w:ind w:firstLine="709"/>
+        <w:jc w:val="both"/>
+      </w:pPr>
+      <w:r>
+        <w:t xml:space="preserve">Для real-time обновления ставок рассматривались polling, Server-Sent Events и WebSocket. Polling создаёт лишнюю нагрузку, потому что клиент постоянно спрашивает сервер даже при отсутствии новых данных. Server-Sent Events подходит для однонаправленной передачи событий от сервера к клиенту, но менее гибок для двустороннего взаимодействия. WebSocket обеспечивает постоянное соединение и минимальную задержку при доставке событий.</w:t>
+      </w:r>
+    </w:p>
+    <w:p>
+      <w:pPr>
+        <w:ind w:firstLine="709"/>
+        <w:jc w:val="both"/>
+      </w:pPr>
+      <w:r>
+        <w:t xml:space="preserve">В проекте выбран SignalR, потому что он является стандартным real-time инструментом в экосистеме ASP.NET Core. SignalR использует WebSocket там, где он доступен, умеет автоматически переключаться на резервные transports и поддерживает автоматическое переподключение клиента. Для AuHub это критично: участники торгов должны видеть новую ставку и изменение текущей цены без перезагрузки страницы. Дополнительно SignalR хорошо интегрируется с JWT-аутентификацией и проксированием через YARP Gateway.</w:t>
+      </w:r>
+    </w:p>
+    <w:p>
+      <w:r>
+        <w:t xml:space="preserve">API-шлюз</w:t>
+      </w:r>
+    </w:p>
+    <w:p>
+      <w:pPr>
+        <w:ind w:firstLine="709"/>
+        <w:jc w:val="both"/>
+      </w:pPr>
+      <w:r>
+        <w:t xml:space="preserve">Для единой точки входа рассматривались Nginx, Traefik и YARP. Nginx является зрелым reverse proxy и подходит для статической маршрутизации, но его конфигурация отделена от кода приложения. Traefik удобен в динамических окружениях и Kubernetes, но для Docker Compose может быть избыточным. YARP является библиотекой Microsoft для reverse proxy, которая встраивается в ASP.NET Core-приложение и конфигурируется в том же технологическом стеке, что и остальные серверные компоненты.</w:t>
+      </w:r>
+    </w:p>
+    <w:p>
+      <w:pPr>
+        <w:ind w:firstLine="709"/>
+        <w:jc w:val="both"/>
+      </w:pPr>
+      <w:r>
+        <w:t xml:space="preserve">В AuHub выбран YARP. Он маршрутизирует запросы к Identity, Auctions, Payment и Notifications сервисам, а также корректно проксирует WebSocket upgrade для SignalR. Важным аргументом стала поддержка session affinity: для real-time соединений желательно, чтобы запросы одного клиента попадали на один экземпляр сервиса. Кроме того, YARP проще расширять middleware-логикой ASP.NET Core, например для заголовков, логирования или ограничений доступа.</w:t>
+      </w:r>
+    </w:p>
+    <w:p>
+      <w:r>
+        <w:t xml:space="preserve">Клиентский язык, фреймворк и интерфейс</w:t>
+      </w:r>
+    </w:p>
+    <w:p>
+      <w:pPr>
+        <w:ind w:firstLine="709"/>
+        <w:jc w:val="both"/>
+      </w:pPr>
+      <w:r>
+        <w:t xml:space="preserve">Для клиентской части рассматривались обычное React-приложение, Vue и Next.js. React удобен для построения компонентного интерфейса, но в формате чистого SPA страницы лотов хуже индексируются поисковыми системами. Vue проще для небольших интерфейсов, но в проекте уже используется TypeScript и React-экосистема. Next.js расширяет React серверным рендерингом, App Router, React Server Components и механизмом generateMetadata.</w:t>
+      </w:r>
+    </w:p>
+    <w:p>
+      <w:pPr>
+        <w:ind w:firstLine="709"/>
+        <w:jc w:val="both"/>
+      </w:pPr>
+      <w:r>
+        <w:t xml:space="preserve">В AuHub выбран TypeScript, React и Next.js. TypeScript позволяет описывать интерфейсы Lot, Bid, User и события SignalR, снижая риск ошибки при работе с API. Next.js нужен для SSR-страниц лотов: поисковый робот получает готовый HTML и метатеги, а интерактивные части страницы — форма ставки, таймер и real-time цена — работают как client components. Tailwind CSS выбран для быстрой и единообразной стилизации интерфейса без отдельной тяжёлой UI-библиотеки.</w:t>
+      </w:r>
+    </w:p>
+    <w:p>
+      <w:r>
+        <w:t xml:space="preserve">Контейнеризация, тестирование и CI</w:t>
+      </w:r>
+    </w:p>
+    <w:p>
+      <w:pPr>
+        <w:ind w:firstLine="709"/>
+        <w:jc w:val="both"/>
+      </w:pPr>
+      <w:r>
+        <w:t xml:space="preserve">Для запуска инфраструктуры рассматривались локальная установка зависимостей, Docker Compose и Kubernetes. Локальная установка PostgreSQL, RabbitMQ, MinIO и нескольких API-сервисов усложняет воспроизводимость окружения. Kubernetes подходит для production-кластеров, но для дипломного проекта и локальной демонстрации он создаёт лишнюю сложность. Docker Compose позволяет описать сервисы, базы данных и инфраструктурные компоненты в одном файле.</w:t>
+      </w:r>
+    </w:p>
+    <w:p>
+      <w:pPr>
+        <w:ind w:firstLine="709"/>
+        <w:jc w:val="both"/>
+      </w:pPr>
+      <w:r>
+        <w:t xml:space="preserve">В проекте выбран Docker Compose: он запускает API-сервисы, отдельные PostgreSQL-базы, RabbitMQ, MinIO, Gateway и frontend одной командой. Для проверки серверной части используются xUnit, FluentAssertions и NSubstitute, а для будущего полного покрытия целесообразны Testcontainers и Playwright. GitHub Actions используется как основа CI, чтобы сборка и тесты выполнялись одинаково независимо от локальной машины разработчика. Такой набор средств приближает дипломный проект к production-like разработке.</w:t>
+      </w:r>
     </w:p>
     <w:p>
       <w:pPr>

</xml_diff>